<commit_message>
Cambios final de dia
</commit_message>
<xml_diff>
--- a/docs/Manual de comandos.docx
+++ b/docs/Manual de comandos.docx
@@ -86,7 +86,7 @@
           <w:r>
             <w:fldChar w:fldCharType="separate"/>
           </w:r>
-          <w:hyperlink w:anchor="_Toc240545878" w:history="1">
+          <w:hyperlink w:anchor="_Toc240546662" w:history="1">
             <w:r>
               <w:rPr>
                 <w:rStyle w:val="Hipervnculo"/>
@@ -113,7 +113,7 @@
                 <w:noProof/>
                 <w:webHidden/>
               </w:rPr>
-              <w:instrText xml:space="preserve"> PAGEREF _Toc240545878 \h </w:instrText>
+              <w:instrText xml:space="preserve"> PAGEREF _Toc240546662 \h </w:instrText>
             </w:r>
             <w:r>
               <w:rPr>
@@ -157,7 +157,7 @@
               <w:lang w:eastAsia="es-ES"/>
             </w:rPr>
           </w:pPr>
-          <w:hyperlink w:anchor="_Toc240545879" w:history="1">
+          <w:hyperlink w:anchor="_Toc240546663" w:history="1">
             <w:r>
               <w:rPr>
                 <w:rStyle w:val="Hipervnculo"/>
@@ -184,7 +184,7 @@
                 <w:noProof/>
                 <w:webHidden/>
               </w:rPr>
-              <w:instrText xml:space="preserve"> PAGEREF _Toc240545879 \h </w:instrText>
+              <w:instrText xml:space="preserve"> PAGEREF _Toc240546663 \h </w:instrText>
             </w:r>
             <w:r>
               <w:rPr>
@@ -228,7 +228,7 @@
               <w:lang w:eastAsia="es-ES"/>
             </w:rPr>
           </w:pPr>
-          <w:hyperlink w:anchor="_Toc240545880" w:history="1">
+          <w:hyperlink w:anchor="_Toc240546664" w:history="1">
             <w:r>
               <w:rPr>
                 <w:rStyle w:val="Hipervnculo"/>
@@ -255,7 +255,7 @@
                 <w:noProof/>
                 <w:webHidden/>
               </w:rPr>
-              <w:instrText xml:space="preserve"> PAGEREF _Toc240545880 \h </w:instrText>
+              <w:instrText xml:space="preserve"> PAGEREF _Toc240546664 \h </w:instrText>
             </w:r>
             <w:r>
               <w:rPr>
@@ -299,7 +299,7 @@
               <w:lang w:eastAsia="es-ES"/>
             </w:rPr>
           </w:pPr>
-          <w:hyperlink w:anchor="_Toc240545881" w:history="1">
+          <w:hyperlink w:anchor="_Toc240546665" w:history="1">
             <w:r>
               <w:rPr>
                 <w:rStyle w:val="Hipervnculo"/>
@@ -326,7 +326,7 @@
                 <w:noProof/>
                 <w:webHidden/>
               </w:rPr>
-              <w:instrText xml:space="preserve"> PAGEREF _Toc240545881 \h </w:instrText>
+              <w:instrText xml:space="preserve"> PAGEREF _Toc240546665 \h </w:instrText>
             </w:r>
             <w:r>
               <w:rPr>
@@ -370,7 +370,7 @@
               <w:lang w:eastAsia="es-ES"/>
             </w:rPr>
           </w:pPr>
-          <w:hyperlink w:anchor="_Toc240545882" w:history="1">
+          <w:hyperlink w:anchor="_Toc240546666" w:history="1">
             <w:r>
               <w:rPr>
                 <w:rStyle w:val="Hipervnculo"/>
@@ -397,7 +397,7 @@
                 <w:noProof/>
                 <w:webHidden/>
               </w:rPr>
-              <w:instrText xml:space="preserve"> PAGEREF _Toc240545882 \h </w:instrText>
+              <w:instrText xml:space="preserve"> PAGEREF _Toc240546666 \h </w:instrText>
             </w:r>
             <w:r>
               <w:rPr>
@@ -441,7 +441,7 @@
               <w:lang w:eastAsia="es-ES"/>
             </w:rPr>
           </w:pPr>
-          <w:hyperlink w:anchor="_Toc240545883" w:history="1">
+          <w:hyperlink w:anchor="_Toc240546667" w:history="1">
             <w:r>
               <w:rPr>
                 <w:rStyle w:val="Hipervnculo"/>
@@ -468,7 +468,220 @@
                 <w:noProof/>
                 <w:webHidden/>
               </w:rPr>
-              <w:instrText xml:space="preserve"> PAGEREF _Toc240545883 \h </w:instrText>
+              <w:instrText xml:space="preserve"> PAGEREF _Toc240546667 \h </w:instrText>
+            </w:r>
+            <w:r>
+              <w:rPr>
+                <w:noProof/>
+                <w:webHidden/>
+              </w:rPr>
+            </w:r>
+            <w:r>
+              <w:rPr>
+                <w:noProof/>
+                <w:webHidden/>
+              </w:rPr>
+              <w:fldChar w:fldCharType="separate"/>
+            </w:r>
+            <w:r>
+              <w:rPr>
+                <w:noProof/>
+                <w:webHidden/>
+              </w:rPr>
+              <w:t>3</w:t>
+            </w:r>
+            <w:r>
+              <w:rPr>
+                <w:noProof/>
+                <w:webHidden/>
+              </w:rPr>
+              <w:fldChar w:fldCharType="end"/>
+            </w:r>
+          </w:hyperlink>
+        </w:p>
+        <w:p>
+          <w:pPr>
+            <w:pStyle w:val="TDC2"/>
+            <w:tabs>
+              <w:tab w:val="right" w:leader="dot" w:pos="8494"/>
+            </w:tabs>
+            <w:rPr>
+              <w:noProof/>
+              <w:sz w:val="22"/>
+              <w:szCs w:val="22"/>
+              <w:lang w:eastAsia="es-ES"/>
+            </w:rPr>
+          </w:pPr>
+          <w:hyperlink w:anchor="_Toc240546668" w:history="1">
+            <w:r>
+              <w:rPr>
+                <w:rStyle w:val="Hipervnculo"/>
+                <w:noProof/>
+              </w:rPr>
+              <w:t>Instalación del modelo llama:</w:t>
+            </w:r>
+            <w:r>
+              <w:rPr>
+                <w:noProof/>
+                <w:webHidden/>
+              </w:rPr>
+              <w:tab/>
+            </w:r>
+            <w:r>
+              <w:rPr>
+                <w:noProof/>
+                <w:webHidden/>
+              </w:rPr>
+              <w:fldChar w:fldCharType="begin"/>
+            </w:r>
+            <w:r>
+              <w:rPr>
+                <w:noProof/>
+                <w:webHidden/>
+              </w:rPr>
+              <w:instrText xml:space="preserve"> PAGEREF _Toc240546668 \h </w:instrText>
+            </w:r>
+            <w:r>
+              <w:rPr>
+                <w:noProof/>
+                <w:webHidden/>
+              </w:rPr>
+            </w:r>
+            <w:r>
+              <w:rPr>
+                <w:noProof/>
+                <w:webHidden/>
+              </w:rPr>
+              <w:fldChar w:fldCharType="separate"/>
+            </w:r>
+            <w:r>
+              <w:rPr>
+                <w:noProof/>
+                <w:webHidden/>
+              </w:rPr>
+              <w:t>3</w:t>
+            </w:r>
+            <w:r>
+              <w:rPr>
+                <w:noProof/>
+                <w:webHidden/>
+              </w:rPr>
+              <w:fldChar w:fldCharType="end"/>
+            </w:r>
+          </w:hyperlink>
+        </w:p>
+        <w:p>
+          <w:pPr>
+            <w:pStyle w:val="TDC2"/>
+            <w:tabs>
+              <w:tab w:val="right" w:leader="dot" w:pos="8494"/>
+            </w:tabs>
+            <w:rPr>
+              <w:noProof/>
+              <w:sz w:val="22"/>
+              <w:szCs w:val="22"/>
+              <w:lang w:eastAsia="es-ES"/>
+            </w:rPr>
+          </w:pPr>
+          <w:hyperlink w:anchor="_Toc240546669" w:history="1">
+            <w:r>
+              <w:rPr>
+                <w:rStyle w:val="Hipervnculo"/>
+                <w:noProof/>
+              </w:rPr>
+              <w:t>Generar los modelsfiles</w:t>
+            </w:r>
+            <w:r>
+              <w:rPr>
+                <w:noProof/>
+                <w:webHidden/>
+              </w:rPr>
+              <w:tab/>
+            </w:r>
+            <w:r>
+              <w:rPr>
+                <w:noProof/>
+                <w:webHidden/>
+              </w:rPr>
+              <w:fldChar w:fldCharType="begin"/>
+            </w:r>
+            <w:r>
+              <w:rPr>
+                <w:noProof/>
+                <w:webHidden/>
+              </w:rPr>
+              <w:instrText xml:space="preserve"> PAGEREF _Toc240546669 \h </w:instrText>
+            </w:r>
+            <w:r>
+              <w:rPr>
+                <w:noProof/>
+                <w:webHidden/>
+              </w:rPr>
+            </w:r>
+            <w:r>
+              <w:rPr>
+                <w:noProof/>
+                <w:webHidden/>
+              </w:rPr>
+              <w:fldChar w:fldCharType="separate"/>
+            </w:r>
+            <w:r>
+              <w:rPr>
+                <w:noProof/>
+                <w:webHidden/>
+              </w:rPr>
+              <w:t>3</w:t>
+            </w:r>
+            <w:r>
+              <w:rPr>
+                <w:noProof/>
+                <w:webHidden/>
+              </w:rPr>
+              <w:fldChar w:fldCharType="end"/>
+            </w:r>
+          </w:hyperlink>
+        </w:p>
+        <w:p>
+          <w:pPr>
+            <w:pStyle w:val="TDC2"/>
+            <w:tabs>
+              <w:tab w:val="right" w:leader="dot" w:pos="8494"/>
+            </w:tabs>
+            <w:rPr>
+              <w:noProof/>
+              <w:sz w:val="22"/>
+              <w:szCs w:val="22"/>
+              <w:lang w:eastAsia="es-ES"/>
+            </w:rPr>
+          </w:pPr>
+          <w:hyperlink w:anchor="_Toc240546670" w:history="1">
+            <w:r>
+              <w:rPr>
+                <w:rStyle w:val="Hipervnculo"/>
+                <w:noProof/>
+              </w:rPr>
+              <w:t>Crear</w:t>
+            </w:r>
+            <w:r>
+              <w:rPr>
+                <w:noProof/>
+                <w:webHidden/>
+              </w:rPr>
+              <w:tab/>
+            </w:r>
+            <w:r>
+              <w:rPr>
+                <w:noProof/>
+                <w:webHidden/>
+              </w:rPr>
+              <w:fldChar w:fldCharType="begin"/>
+            </w:r>
+            <w:r>
+              <w:rPr>
+                <w:noProof/>
+                <w:webHidden/>
+              </w:rPr>
+              <w:instrText xml:space="preserve"> PAGEREF _Toc240546670 \h </w:instrText>
             </w:r>
             <w:r>
               <w:rPr>
@@ -512,7 +725,7 @@
               <w:lang w:eastAsia="es-ES"/>
             </w:rPr>
           </w:pPr>
-          <w:hyperlink w:anchor="_Toc240545884" w:history="1">
+          <w:hyperlink w:anchor="_Toc240546671" w:history="1">
             <w:r>
               <w:rPr>
                 <w:rStyle w:val="Hipervnculo"/>
@@ -539,7 +752,7 @@
                 <w:noProof/>
                 <w:webHidden/>
               </w:rPr>
-              <w:instrText xml:space="preserve"> PAGEREF _Toc240545884 \h </w:instrText>
+              <w:instrText xml:space="preserve"> PAGEREF _Toc240546671 \h </w:instrText>
             </w:r>
             <w:r>
               <w:rPr>
@@ -601,7 +814,7 @@
       <w:pPr>
         <w:pStyle w:val="Ttulo1"/>
       </w:pPr>
-      <w:bookmarkStart w:id="0" w:name="_Toc240545878"/>
+      <w:bookmarkStart w:id="0" w:name="_Toc240546662"/>
       <w:r>
         <w:lastRenderedPageBreak/>
         <w:t>Introducción</w:t>
@@ -636,7 +849,7 @@
       <w:pPr>
         <w:pStyle w:val="Ttulo1"/>
       </w:pPr>
-      <w:bookmarkStart w:id="1" w:name="_Toc240545879"/>
+      <w:bookmarkStart w:id="1" w:name="_Toc240546663"/>
       <w:r>
         <w:t>Comandos spaCy</w:t>
       </w:r>
@@ -651,12 +864,9 @@
       <w:pPr>
         <w:pStyle w:val="Ttulo2"/>
       </w:pPr>
-      <w:bookmarkStart w:id="2" w:name="_Toc240545880"/>
-      <w:r>
-        <w:t>R</w:t>
-      </w:r>
-      <w:r>
-        <w:t>ecoger datos de entrenamiento para nlp:</w:t>
+      <w:bookmarkStart w:id="2" w:name="_Toc240546664"/>
+      <w:r>
+        <w:t>Recoger datos de entrenamiento para nlp:</w:t>
       </w:r>
       <w:bookmarkEnd w:id="2"/>
     </w:p>
@@ -690,7 +900,7 @@
       <w:pPr>
         <w:pStyle w:val="Ttulo2"/>
       </w:pPr>
-      <w:bookmarkStart w:id="3" w:name="_Toc240545881"/>
+      <w:bookmarkStart w:id="3" w:name="_Toc240546665"/>
       <w:r>
         <w:t>Crear el config:</w:t>
       </w:r>
@@ -711,7 +921,7 @@
       <w:pPr>
         <w:pStyle w:val="Ttulo2"/>
       </w:pPr>
-      <w:bookmarkStart w:id="4" w:name="_Toc240545882"/>
+      <w:bookmarkStart w:id="4" w:name="_Toc240546666"/>
       <w:r>
         <w:t>Crear la pipeline:</w:t>
       </w:r>
@@ -738,7 +948,7 @@
       <w:pPr>
         <w:pStyle w:val="Ttulo1"/>
       </w:pPr>
-      <w:bookmarkStart w:id="5" w:name="_Toc240545883"/>
+      <w:bookmarkStart w:id="5" w:name="_Toc240546667"/>
       <w:r>
         <w:t>Comandos LLM</w:t>
       </w:r>
@@ -761,9 +971,11 @@
       <w:pPr>
         <w:pStyle w:val="Ttulo2"/>
       </w:pPr>
+      <w:bookmarkStart w:id="6" w:name="_Toc240546668"/>
       <w:r>
         <w:t>Instalación del modelo llama:</w:t>
       </w:r>
+      <w:bookmarkEnd w:id="6"/>
     </w:p>
     <w:p>
       <w:pPr>
@@ -777,9 +989,11 @@
       <w:pPr>
         <w:pStyle w:val="Ttulo2"/>
       </w:pPr>
+      <w:bookmarkStart w:id="7" w:name="_Toc240546669"/>
       <w:r>
         <w:t>Generar los modelsfiles</w:t>
       </w:r>
+      <w:bookmarkEnd w:id="7"/>
     </w:p>
     <w:p>
       <w:pPr>
@@ -793,21 +1007,86 @@
       <w:pPr>
         <w:pStyle w:val="Ttulo2"/>
       </w:pPr>
+      <w:bookmarkStart w:id="8" w:name="_Toc240546670"/>
       <w:r>
         <w:t>Crear</w:t>
       </w:r>
+      <w:bookmarkEnd w:id="8"/>
+      <w:r>
+        <w:t xml:space="preserve"> las instancias de los modelos LLM</w:t>
+      </w:r>
+    </w:p>
+    <w:p>
+      <w:pPr>
+        <w:pStyle w:val="Cdigo"/>
+      </w:pPr>
+      <w:r>
+        <w:t>python manage.py generar_modelfiles</w:t>
+      </w:r>
+      <w:r>
+        <w:t xml:space="preserve"> --crear</w:t>
+      </w:r>
     </w:p>
     <w:p>
       <w:pPr>
         <w:pStyle w:val="Ttulo1"/>
       </w:pPr>
-      <w:bookmarkStart w:id="6" w:name="_Toc240545884"/>
+      <w:bookmarkStart w:id="9" w:name="_Toc240546671"/>
       <w:r>
         <w:t>Comandos de importación de datos</w:t>
       </w:r>
-      <w:bookmarkEnd w:id="6"/>
-    </w:p>
-    <w:p/>
+      <w:bookmarkEnd w:id="9"/>
+    </w:p>
+    <w:p>
+      <w:r>
+        <w:t>Esta sección de comandos se encarga de importar datos iniciales para iniciar rápido el proceso de entrenamiento.</w:t>
+      </w:r>
+    </w:p>
+    <w:p>
+      <w:pPr>
+        <w:pStyle w:val="Ttulo2"/>
+      </w:pPr>
+      <w:r>
+        <w:t>Ubicación de los datos de entrenamiento:</w:t>
+      </w:r>
+    </w:p>
+    <w:p>
+      <w:r>
+        <w:t>Los datos iniciales de entrenamiento se encuentran en la carpeta entrenamiento/datos en formato CSV</w:t>
+      </w:r>
+    </w:p>
+    <w:p>
+      <w:pPr>
+        <w:pStyle w:val="Ttulo2"/>
+      </w:pPr>
+      <w:r>
+        <w:t>Ubicación de los comandos de importación:</w:t>
+      </w:r>
+    </w:p>
+    <w:p>
+      <w:r>
+        <w:t xml:space="preserve">Los comandos de importación se encuentran en la carpeta </w:t>
+      </w:r>
+      <w:r>
+        <w:t>entrenamiento/management/comands</w:t>
+      </w:r>
+      <w:r>
+        <w:t xml:space="preserve"> y son específicamente los que empiezan por cargar_</w:t>
+      </w:r>
+    </w:p>
+    <w:p>
+      <w:pPr>
+        <w:rPr>
+          <w:u w:val="single"/>
+        </w:rPr>
+      </w:pPr>
+      <w:r>
+        <w:t xml:space="preserve">Cada uno se encarga de importar </w:t>
+      </w:r>
+      <w:r>
+        <w:t>importar cada dato.</w:t>
+      </w:r>
+    </w:p>
     <w:sectPr>
       <w:footerReference w:type="default" r:id="rId9"/>
       <w:pgSz w:w="11906" w:h="16838"/>
@@ -1789,6 +2068,7 @@
   <w:style w:type="character" w:default="1" w:styleId="Fuentedeprrafopredeter">
     <w:name w:val="Default Paragraph Font"/>
     <w:uiPriority w:val="1"/>
+    <w:semiHidden/>
     <w:unhideWhenUsed/>
   </w:style>
   <w:style w:type="table" w:default="1" w:styleId="Tablanormal">

</xml_diff>